<commit_message>
converted docx to pdf
</commit_message>
<xml_diff>
--- a/Day2/Jenkins-PP-tf-stages-Part2.docx
+++ b/Day2/Jenkins-PP-tf-stages-Part2.docx
@@ -325,6 +325,18 @@
       </w:r>
       <w:r>
         <w:t>M</w:t>
+      </w:r>
+    </w:p>
+    <w:p>
+      <w:pPr>
+        <w:pStyle w:val="ListParagraph"/>
+        <w:numPr>
+          <w:ilvl w:val="0"/>
+          <w:numId w:val="1"/>
+        </w:numPr>
+      </w:pPr>
+      <w:r>
+        <w:t xml:space="preserve">Adding workspace cleanup </w:t>
       </w:r>
     </w:p>
     <w:p/>
@@ -510,6 +522,7 @@
           <w:szCs w:val="21"/>
           <w14:ligatures w14:val="none"/>
         </w:rPr>
+        <w:lastRenderedPageBreak/>
         <w:t>  agent any</w:t>
       </w:r>
     </w:p>
@@ -562,7 +575,6 @@
           <w:szCs w:val="21"/>
           <w14:ligatures w14:val="none"/>
         </w:rPr>
-        <w:lastRenderedPageBreak/>
         <w:t>    stage(</w:t>
       </w:r>
       <w:r>
@@ -3041,6 +3053,513 @@
     <w:p>
       <w:pPr>
         <w:ind w:left="360"/>
+      </w:pPr>
+    </w:p>
+    <w:p>
+      <w:pPr>
+        <w:ind w:left="360"/>
+      </w:pPr>
+      <w:r>
+        <w:t xml:space="preserve">Every 3 min </w:t>
+      </w:r>
+      <w:proofErr w:type="gramStart"/>
+      <w:r>
+        <w:t>its</w:t>
+      </w:r>
+      <w:proofErr w:type="gramEnd"/>
+      <w:r>
+        <w:t xml:space="preserve"> polling </w:t>
+      </w:r>
+    </w:p>
+    <w:p>
+      <w:pPr>
+        <w:ind w:left="360"/>
+      </w:pPr>
+      <w:r>
+        <w:drawing>
+          <wp:inline distT="0" distB="0" distL="0" distR="0" wp14:anchorId="1C2EB597" wp14:editId="44590446">
+            <wp:extent cx="5943600" cy="3212465"/>
+            <wp:effectExtent l="0" t="0" r="0" b="6985"/>
+            <wp:docPr id="382448816" name="Picture 1"/>
+            <wp:cNvGraphicFramePr>
+              <a:graphicFrameLocks xmlns:a="http://schemas.openxmlformats.org/drawingml/2006/main" noChangeAspect="1"/>
+            </wp:cNvGraphicFramePr>
+            <a:graphic xmlns:a="http://schemas.openxmlformats.org/drawingml/2006/main">
+              <a:graphicData uri="http://schemas.openxmlformats.org/drawingml/2006/picture">
+                <pic:pic xmlns:pic="http://schemas.openxmlformats.org/drawingml/2006/picture">
+                  <pic:nvPicPr>
+                    <pic:cNvPr id="382448816" name=""/>
+                    <pic:cNvPicPr/>
+                  </pic:nvPicPr>
+                  <pic:blipFill>
+                    <a:blip r:embed="rId26"/>
+                    <a:stretch>
+                      <a:fillRect/>
+                    </a:stretch>
+                  </pic:blipFill>
+                  <pic:spPr>
+                    <a:xfrm>
+                      <a:off x="0" y="0"/>
+                      <a:ext cx="5943600" cy="3212465"/>
+                    </a:xfrm>
+                    <a:prstGeom prst="rect">
+                      <a:avLst/>
+                    </a:prstGeom>
+                  </pic:spPr>
+                </pic:pic>
+              </a:graphicData>
+            </a:graphic>
+          </wp:inline>
+        </w:drawing>
+      </w:r>
+    </w:p>
+    <w:p>
+      <w:pPr>
+        <w:ind w:left="360"/>
+      </w:pPr>
+    </w:p>
+    <w:p>
+      <w:pPr>
+        <w:ind w:left="360"/>
+      </w:pPr>
+    </w:p>
+    <w:p>
+      <w:pPr>
+        <w:ind w:left="360"/>
+      </w:pPr>
+    </w:p>
+    <w:p>
+      <w:pPr>
+        <w:pStyle w:val="ListParagraph"/>
+        <w:numPr>
+          <w:ilvl w:val="0"/>
+          <w:numId w:val="1"/>
+        </w:numPr>
+      </w:pPr>
+      <w:r>
+        <w:t xml:space="preserve">Adding workspace cleanup </w:t>
+      </w:r>
+    </w:p>
+    <w:p>
+      <w:pPr>
+        <w:pStyle w:val="ListParagraph"/>
+      </w:pPr>
+      <w:r>
+        <w:drawing>
+          <wp:inline distT="0" distB="0" distL="0" distR="0" wp14:anchorId="5F0BA7D8" wp14:editId="458A6AE0">
+            <wp:extent cx="5943600" cy="3820795"/>
+            <wp:effectExtent l="0" t="0" r="0" b="8255"/>
+            <wp:docPr id="581810538" name="Picture 1"/>
+            <wp:cNvGraphicFramePr>
+              <a:graphicFrameLocks xmlns:a="http://schemas.openxmlformats.org/drawingml/2006/main" noChangeAspect="1"/>
+            </wp:cNvGraphicFramePr>
+            <a:graphic xmlns:a="http://schemas.openxmlformats.org/drawingml/2006/main">
+              <a:graphicData uri="http://schemas.openxmlformats.org/drawingml/2006/picture">
+                <pic:pic xmlns:pic="http://schemas.openxmlformats.org/drawingml/2006/picture">
+                  <pic:nvPicPr>
+                    <pic:cNvPr id="581810538" name=""/>
+                    <pic:cNvPicPr/>
+                  </pic:nvPicPr>
+                  <pic:blipFill>
+                    <a:blip r:embed="rId27"/>
+                    <a:stretch>
+                      <a:fillRect/>
+                    </a:stretch>
+                  </pic:blipFill>
+                  <pic:spPr>
+                    <a:xfrm>
+                      <a:off x="0" y="0"/>
+                      <a:ext cx="5943600" cy="3820795"/>
+                    </a:xfrm>
+                    <a:prstGeom prst="rect">
+                      <a:avLst/>
+                    </a:prstGeom>
+                  </pic:spPr>
+                </pic:pic>
+              </a:graphicData>
+            </a:graphic>
+          </wp:inline>
+        </w:drawing>
+      </w:r>
+    </w:p>
+    <w:p>
+      <w:pPr>
+        <w:pStyle w:val="ListParagraph"/>
+      </w:pPr>
+    </w:p>
+    <w:p>
+      <w:pPr>
+        <w:pStyle w:val="ListParagraph"/>
+        <w:rPr>
+          <w:i/>
+          <w:iCs/>
+        </w:rPr>
+      </w:pPr>
+      <w:r>
+        <w:rPr>
+          <w:i/>
+          <w:iCs/>
+        </w:rPr>
+        <w:t xml:space="preserve">    </w:t>
+      </w:r>
+      <w:proofErr w:type="gramStart"/>
+      <w:r>
+        <w:rPr>
+          <w:i/>
+          <w:iCs/>
+        </w:rPr>
+        <w:t>stage(</w:t>
+      </w:r>
+      <w:proofErr w:type="gramEnd"/>
+      <w:r>
+        <w:rPr>
+          <w:i/>
+          <w:iCs/>
+        </w:rPr>
+        <w:t>'Cleanup Workspace') {</w:t>
+      </w:r>
+    </w:p>
+    <w:p>
+      <w:pPr>
+        <w:pStyle w:val="ListParagraph"/>
+        <w:rPr>
+          <w:i/>
+          <w:iCs/>
+        </w:rPr>
+      </w:pPr>
+      <w:r>
+        <w:rPr>
+          <w:i/>
+          <w:iCs/>
+        </w:rPr>
+        <w:t>      steps {</w:t>
+      </w:r>
+    </w:p>
+    <w:p>
+      <w:pPr>
+        <w:pStyle w:val="ListParagraph"/>
+        <w:rPr>
+          <w:i/>
+          <w:iCs/>
+        </w:rPr>
+      </w:pPr>
+      <w:r>
+        <w:rPr>
+          <w:i/>
+          <w:iCs/>
+        </w:rPr>
+        <w:t xml:space="preserve">        </w:t>
+      </w:r>
+      <w:proofErr w:type="spellStart"/>
+      <w:proofErr w:type="gramStart"/>
+      <w:r>
+        <w:rPr>
+          <w:i/>
+          <w:iCs/>
+        </w:rPr>
+        <w:t>deleteDir</w:t>
+      </w:r>
+      <w:proofErr w:type="spellEnd"/>
+      <w:r>
+        <w:rPr>
+          <w:i/>
+          <w:iCs/>
+        </w:rPr>
+        <w:t>(</w:t>
+      </w:r>
+      <w:proofErr w:type="gramEnd"/>
+      <w:r>
+        <w:rPr>
+          <w:i/>
+          <w:iCs/>
+        </w:rPr>
+        <w:t>)</w:t>
+      </w:r>
+    </w:p>
+    <w:p>
+      <w:pPr>
+        <w:pStyle w:val="ListParagraph"/>
+        <w:rPr>
+          <w:i/>
+          <w:iCs/>
+        </w:rPr>
+      </w:pPr>
+      <w:r>
+        <w:rPr>
+          <w:i/>
+          <w:iCs/>
+        </w:rPr>
+        <w:t>      }</w:t>
+      </w:r>
+    </w:p>
+    <w:p>
+      <w:pPr>
+        <w:pStyle w:val="ListParagraph"/>
+        <w:rPr>
+          <w:i/>
+          <w:iCs/>
+        </w:rPr>
+      </w:pPr>
+      <w:r>
+        <w:rPr>
+          <w:i/>
+          <w:iCs/>
+        </w:rPr>
+        <w:t>    }</w:t>
+      </w:r>
+    </w:p>
+    <w:p>
+      <w:pPr>
+        <w:pStyle w:val="ListParagraph"/>
+      </w:pPr>
+    </w:p>
+    <w:p>
+      <w:pPr>
+        <w:pStyle w:val="ListParagraph"/>
+      </w:pPr>
+    </w:p>
+    <w:p>
+      <w:pPr>
+        <w:pStyle w:val="ListParagraph"/>
+        <w:rPr>
+          <w:b/>
+          <w:bCs/>
+        </w:rPr>
+      </w:pPr>
+      <w:r>
+        <w:rPr>
+          <w:b/>
+          <w:bCs/>
+        </w:rPr>
+        <w:t xml:space="preserve">Run the git commands </w:t>
+      </w:r>
+    </w:p>
+    <w:p>
+      <w:pPr>
+        <w:pStyle w:val="ListParagraph"/>
+      </w:pPr>
+      <w:r>
+        <w:lastRenderedPageBreak/>
+        <w:drawing>
+          <wp:inline distT="0" distB="0" distL="0" distR="0" wp14:anchorId="120F747B" wp14:editId="3D50BC87">
+            <wp:extent cx="5943600" cy="2629535"/>
+            <wp:effectExtent l="0" t="0" r="0" b="0"/>
+            <wp:docPr id="1730101583" name="Picture 1"/>
+            <wp:cNvGraphicFramePr>
+              <a:graphicFrameLocks xmlns:a="http://schemas.openxmlformats.org/drawingml/2006/main" noChangeAspect="1"/>
+            </wp:cNvGraphicFramePr>
+            <a:graphic xmlns:a="http://schemas.openxmlformats.org/drawingml/2006/main">
+              <a:graphicData uri="http://schemas.openxmlformats.org/drawingml/2006/picture">
+                <pic:pic xmlns:pic="http://schemas.openxmlformats.org/drawingml/2006/picture">
+                  <pic:nvPicPr>
+                    <pic:cNvPr id="1730101583" name=""/>
+                    <pic:cNvPicPr/>
+                  </pic:nvPicPr>
+                  <pic:blipFill>
+                    <a:blip r:embed="rId28"/>
+                    <a:stretch>
+                      <a:fillRect/>
+                    </a:stretch>
+                  </pic:blipFill>
+                  <pic:spPr>
+                    <a:xfrm>
+                      <a:off x="0" y="0"/>
+                      <a:ext cx="5943600" cy="2629535"/>
+                    </a:xfrm>
+                    <a:prstGeom prst="rect">
+                      <a:avLst/>
+                    </a:prstGeom>
+                  </pic:spPr>
+                </pic:pic>
+              </a:graphicData>
+            </a:graphic>
+          </wp:inline>
+        </w:drawing>
+      </w:r>
+    </w:p>
+    <w:p>
+      <w:pPr>
+        <w:pStyle w:val="ListParagraph"/>
+      </w:pPr>
+    </w:p>
+    <w:p>
+      <w:pPr>
+        <w:pStyle w:val="ListParagraph"/>
+      </w:pPr>
+      <w:r>
+        <w:t>Wait for the polling to happen</w:t>
+      </w:r>
+    </w:p>
+    <w:p>
+      <w:pPr>
+        <w:pStyle w:val="ListParagraph"/>
+      </w:pPr>
+    </w:p>
+    <w:p>
+      <w:pPr>
+        <w:pStyle w:val="ListParagraph"/>
+      </w:pPr>
+      <w:r>
+        <w:drawing>
+          <wp:inline distT="0" distB="0" distL="0" distR="0" wp14:anchorId="687F89CA" wp14:editId="0A5B95DC">
+            <wp:extent cx="5943600" cy="3491230"/>
+            <wp:effectExtent l="0" t="0" r="0" b="0"/>
+            <wp:docPr id="939354690" name="Picture 1"/>
+            <wp:cNvGraphicFramePr>
+              <a:graphicFrameLocks xmlns:a="http://schemas.openxmlformats.org/drawingml/2006/main" noChangeAspect="1"/>
+            </wp:cNvGraphicFramePr>
+            <a:graphic xmlns:a="http://schemas.openxmlformats.org/drawingml/2006/main">
+              <a:graphicData uri="http://schemas.openxmlformats.org/drawingml/2006/picture">
+                <pic:pic xmlns:pic="http://schemas.openxmlformats.org/drawingml/2006/picture">
+                  <pic:nvPicPr>
+                    <pic:cNvPr id="939354690" name=""/>
+                    <pic:cNvPicPr/>
+                  </pic:nvPicPr>
+                  <pic:blipFill>
+                    <a:blip r:embed="rId29"/>
+                    <a:stretch>
+                      <a:fillRect/>
+                    </a:stretch>
+                  </pic:blipFill>
+                  <pic:spPr>
+                    <a:xfrm>
+                      <a:off x="0" y="0"/>
+                      <a:ext cx="5943600" cy="3491230"/>
+                    </a:xfrm>
+                    <a:prstGeom prst="rect">
+                      <a:avLst/>
+                    </a:prstGeom>
+                  </pic:spPr>
+                </pic:pic>
+              </a:graphicData>
+            </a:graphic>
+          </wp:inline>
+        </w:drawing>
+      </w:r>
+    </w:p>
+    <w:p>
+      <w:pPr>
+        <w:pStyle w:val="ListParagraph"/>
+      </w:pPr>
+      <w:r>
+        <w:lastRenderedPageBreak/>
+        <w:drawing>
+          <wp:inline distT="0" distB="0" distL="0" distR="0" wp14:anchorId="7CF415E5" wp14:editId="4F729448">
+            <wp:extent cx="5943600" cy="5440045"/>
+            <wp:effectExtent l="0" t="0" r="0" b="8255"/>
+            <wp:docPr id="246429975" name="Picture 1"/>
+            <wp:cNvGraphicFramePr>
+              <a:graphicFrameLocks xmlns:a="http://schemas.openxmlformats.org/drawingml/2006/main" noChangeAspect="1"/>
+            </wp:cNvGraphicFramePr>
+            <a:graphic xmlns:a="http://schemas.openxmlformats.org/drawingml/2006/main">
+              <a:graphicData uri="http://schemas.openxmlformats.org/drawingml/2006/picture">
+                <pic:pic xmlns:pic="http://schemas.openxmlformats.org/drawingml/2006/picture">
+                  <pic:nvPicPr>
+                    <pic:cNvPr id="246429975" name=""/>
+                    <pic:cNvPicPr/>
+                  </pic:nvPicPr>
+                  <pic:blipFill>
+                    <a:blip r:embed="rId30"/>
+                    <a:stretch>
+                      <a:fillRect/>
+                    </a:stretch>
+                  </pic:blipFill>
+                  <pic:spPr>
+                    <a:xfrm>
+                      <a:off x="0" y="0"/>
+                      <a:ext cx="5943600" cy="5440045"/>
+                    </a:xfrm>
+                    <a:prstGeom prst="rect">
+                      <a:avLst/>
+                    </a:prstGeom>
+                  </pic:spPr>
+                </pic:pic>
+              </a:graphicData>
+            </a:graphic>
+          </wp:inline>
+        </w:drawing>
+      </w:r>
+    </w:p>
+    <w:p>
+      <w:pPr>
+        <w:pStyle w:val="ListParagraph"/>
+      </w:pPr>
+    </w:p>
+    <w:p>
+      <w:pPr>
+        <w:pStyle w:val="ListParagraph"/>
+      </w:pPr>
+      <w:r>
+        <w:t>Proof of cleanup</w:t>
+      </w:r>
+    </w:p>
+    <w:p>
+      <w:pPr>
+        <w:pStyle w:val="ListParagraph"/>
+      </w:pPr>
+    </w:p>
+    <w:p>
+      <w:pPr>
+        <w:pStyle w:val="ListParagraph"/>
+      </w:pPr>
+      <w:r>
+        <w:lastRenderedPageBreak/>
+        <w:drawing>
+          <wp:inline distT="0" distB="0" distL="0" distR="0" wp14:anchorId="1758D771" wp14:editId="150598BA">
+            <wp:extent cx="5943600" cy="4822825"/>
+            <wp:effectExtent l="0" t="0" r="0" b="0"/>
+            <wp:docPr id="243451331" name="Picture 1"/>
+            <wp:cNvGraphicFramePr>
+              <a:graphicFrameLocks xmlns:a="http://schemas.openxmlformats.org/drawingml/2006/main" noChangeAspect="1"/>
+            </wp:cNvGraphicFramePr>
+            <a:graphic xmlns:a="http://schemas.openxmlformats.org/drawingml/2006/main">
+              <a:graphicData uri="http://schemas.openxmlformats.org/drawingml/2006/picture">
+                <pic:pic xmlns:pic="http://schemas.openxmlformats.org/drawingml/2006/picture">
+                  <pic:nvPicPr>
+                    <pic:cNvPr id="243451331" name=""/>
+                    <pic:cNvPicPr/>
+                  </pic:nvPicPr>
+                  <pic:blipFill>
+                    <a:blip r:embed="rId31"/>
+                    <a:stretch>
+                      <a:fillRect/>
+                    </a:stretch>
+                  </pic:blipFill>
+                  <pic:spPr>
+                    <a:xfrm>
+                      <a:off x="0" y="0"/>
+                      <a:ext cx="5943600" cy="4822825"/>
+                    </a:xfrm>
+                    <a:prstGeom prst="rect">
+                      <a:avLst/>
+                    </a:prstGeom>
+                  </pic:spPr>
+                </pic:pic>
+              </a:graphicData>
+            </a:graphic>
+          </wp:inline>
+        </w:drawing>
+      </w:r>
+    </w:p>
+    <w:p>
+      <w:pPr>
+        <w:pStyle w:val="ListParagraph"/>
+      </w:pPr>
+      <w:r>
+        <w:t xml:space="preserve">The workspace </w:t>
+      </w:r>
+      <w:proofErr w:type="gramStart"/>
+      <w:r>
+        <w:t>is not having</w:t>
+      </w:r>
+      <w:proofErr w:type="gramEnd"/>
+      <w:r>
+        <w:t xml:space="preserve"> the link anymore </w:t>
+      </w:r>
+    </w:p>
+    <w:p>
+      <w:pPr>
+        <w:pStyle w:val="ListParagraph"/>
       </w:pPr>
     </w:p>
     <w:sectPr>

</xml_diff>